<commit_message>
Fine tunning for Swin
For fine tunning added a optimizer for swin and moved around the lr scheduler
</commit_message>
<xml_diff>
--- a/Report.docx
+++ b/Report.docx
@@ -23,9 +23,8 @@
           <w:szCs w:val="36"/>
           <w:lang w:val="en-IN"/>
         </w:rPr>
-        <w:t xml:space="preserve">Transformers Vs CNN For Audio </w:t>
-      </w:r>
-      <w:proofErr w:type="spellStart"/>
+        <w:t>Transformers Vs CNN For Audio Deep</w:t>
+      </w:r>
       <w:r>
         <w:rPr>
           <w:rFonts w:asciiTheme="majorHAnsi" w:hAnsiTheme="majorHAnsi"/>
@@ -35,7 +34,7 @@
           <w:szCs w:val="36"/>
           <w:lang w:val="en-IN"/>
         </w:rPr>
-        <w:t>Deep</w:t>
+        <w:t>F</w:t>
       </w:r>
       <w:r>
         <w:rPr>
@@ -46,20 +45,8 @@
           <w:szCs w:val="36"/>
           <w:lang w:val="en-IN"/>
         </w:rPr>
-        <w:t>F</w:t>
-      </w:r>
-      <w:r>
-        <w:rPr>
-          <w:rFonts w:asciiTheme="majorHAnsi" w:hAnsiTheme="majorHAnsi"/>
-          <w:b/>
-          <w:bCs/>
-          <w:sz w:val="36"/>
-          <w:szCs w:val="36"/>
-          <w:lang w:val="en-IN"/>
-        </w:rPr>
         <w:t>ake</w:t>
       </w:r>
-      <w:proofErr w:type="spellEnd"/>
     </w:p>
     <w:p>
       <w:pPr>
@@ -244,21 +231,7 @@
         <w:rPr>
           <w:lang w:val="en-IN"/>
         </w:rPr>
-        <w:t>Conversely, the emergence of the Vision Transformer (</w:t>
-      </w:r>
-      <w:proofErr w:type="spellStart"/>
-      <w:r>
-        <w:rPr>
-          <w:lang w:val="en-IN"/>
-        </w:rPr>
-        <w:t>ViT</w:t>
-      </w:r>
-      <w:proofErr w:type="spellEnd"/>
-      <w:r>
-        <w:rPr>
-          <w:lang w:val="en-IN"/>
-        </w:rPr>
-        <w:t xml:space="preserve">) has introduced an alternative processing framework. By discarding localized convolutional strides and instead flattening </w:t>
+        <w:t xml:space="preserve">Conversely, the emergence of the Vision Transformer (ViT) has introduced an alternative processing framework. By discarding localized convolutional strides and instead flattening </w:t>
       </w:r>
       <w:r>
         <w:rPr>
@@ -317,13 +290,8 @@
     </w:p>
     <w:p>
       <w:r>
-        <w:t xml:space="preserve">As the sole investigator of this project, I designed, implemented, and optimized the entire machine learning pipeline from raw audio ingestion to final model distillation. The specific contributions of my independent work are as </w:t>
-      </w:r>
-      <w:proofErr w:type="gramStart"/>
-      <w:r>
-        <w:t>follow</w:t>
-      </w:r>
-      <w:proofErr w:type="gramEnd"/>
+        <w:t>As the sole investigator of this project, I designed, implemented, and optimized the entire machine learning pipeline from raw audio ingestion to final model distillation. The specific contributions of my independent work are as follow</w:t>
+      </w:r>
       <w:r>
         <w:t>:</w:t>
       </w:r>
@@ -347,13 +315,8 @@
         <w:t xml:space="preserve">End-to-End Pipeline Engineering: </w:t>
       </w:r>
       <w:r>
-        <w:t xml:space="preserve">I built a highly optimized data processing pipeline that decouples feature extraction from backpropagation by pre-computing spectrogram tensors to ram and </w:t>
-      </w:r>
-      <w:proofErr w:type="gramStart"/>
-      <w:r>
-        <w:t>pre caching</w:t>
-      </w:r>
-      <w:proofErr w:type="gramEnd"/>
+        <w:t>I built a highly optimized data processing pipeline that decouples feature extraction from backpropagation by pre-computing spectrogram tensors to ram and pre caching</w:t>
+      </w:r>
       <w:r>
         <w:t xml:space="preserve"> that reduced the compute time significantly</w:t>
       </w:r>
@@ -380,23 +343,7 @@
         <w:t>Rigorous Empirical Benchmarking:</w:t>
       </w:r>
       <w:r>
-        <w:t xml:space="preserve"> I independently managed the configuration, tracking, and training of six distinct deep learning frameworks: two pure CNN variants (ResNet18, ResNet50), a global projection transformer (</w:t>
-      </w:r>
-      <w:proofErr w:type="spellStart"/>
-      <w:r>
-        <w:t>ViT</w:t>
-      </w:r>
-      <w:proofErr w:type="spellEnd"/>
-      <w:r>
-        <w:t>), a localized hierarchical window transformer (Swin), a cross-attention CNN-Transformer hybrid, and a teacher-student distilled framework (</w:t>
-      </w:r>
-      <w:proofErr w:type="spellStart"/>
-      <w:r>
-        <w:t>DeiT</w:t>
-      </w:r>
-      <w:proofErr w:type="spellEnd"/>
-      <w:r>
-        <w:t>).</w:t>
+        <w:t xml:space="preserve"> I independently managed the configuration, tracking, and training of six distinct deep learning frameworks: two pure CNN variants (ResNet18, ResNet50), a global projection transformer (ViT), a localized hierarchical window transformer (Swin), a cross-attention CNN-Transformer hybrid, and a teacher-student distilled framework (DeiT).</w:t>
       </w:r>
     </w:p>
     <w:p>
@@ -615,21 +562,7 @@
         <w:rPr>
           <w:lang w:val="en-IN"/>
         </w:rPr>
-        <w:t xml:space="preserve">The Swin Transformer bridges the gap between CNN efficiency and Transformer expressiveness. Instead of computing global attention across the entire spectrogram </w:t>
-      </w:r>
-      <w:proofErr w:type="gramStart"/>
-      <w:r>
-        <w:rPr>
-          <w:lang w:val="en-IN"/>
-        </w:rPr>
-        <w:t>( which</w:t>
-      </w:r>
-      <w:proofErr w:type="gramEnd"/>
-      <w:r>
-        <w:rPr>
-          <w:lang w:val="en-IN"/>
-        </w:rPr>
-        <w:t xml:space="preserve"> scales quadratically with image size), Swin computes attention strictly within localized, non-overlapping 2D windows. To preserve cross- window communication, it introduces a </w:t>
+        <w:t xml:space="preserve">The Swin Transformer bridges the gap between CNN efficiency and Transformer expressiveness. Instead of computing global attention across the entire spectrogram ( which scales quadratically with image size), Swin computes attention strictly within localized, non-overlapping 2D windows. To preserve cross- window communication, it introduces a </w:t>
       </w:r>
       <w:r>
         <w:rPr>
@@ -660,6 +593,7 @@
       </w:pPr>
       <w:r>
         <w:rPr>
+          <w:noProof/>
           <w:lang w:val="en-IN"/>
         </w:rPr>
         <w:drawing>
@@ -746,23 +680,7 @@
           <w:b/>
           <w:bCs/>
         </w:rPr>
-        <w:t xml:space="preserve">). As detailed in (a), the framework </w:t>
-      </w:r>
-      <w:proofErr w:type="spellStart"/>
-      <w:r>
-        <w:rPr>
-          <w:b/>
-          <w:bCs/>
-        </w:rPr>
-        <w:t>downsamples</w:t>
-      </w:r>
-      <w:proofErr w:type="spellEnd"/>
-      <w:r>
-        <w:rPr>
-          <w:b/>
-          <w:bCs/>
-        </w:rPr>
-        <w:t xml:space="preserve"> time-frequency dimensions across four discrete stages via Patch Merging to simulate a CNN's feature hierarchy. Part (b) outlines two successive blocks: the first applies standard Window-based Multi-Head Self-Attention (W-MSA) within isolated boundaries, while the second introduces a Shifted Window approach (SW-MSA) to establish cross-window connectivity across the acoustic spectrogram.</w:t>
+        <w:t>). As detailed in (a), the framework downsamples time-frequency dimensions across four discrete stages via Patch Merging to simulate a CNN's feature hierarchy. Part (b) outlines two successive blocks: the first applies standard Window-based Multi-Head Self-Attention (W-MSA) within isolated boundaries, while the second introduces a Shifted Window approach (SW-MSA) to establish cross-window connectivity across the acoustic spectrogram.</w:t>
       </w:r>
     </w:p>
     <w:p>
@@ -813,36 +731,17 @@
         <w:rPr>
           <w:lang w:val="en-IN"/>
         </w:rPr>
-        <w:t>Conversely, the emergence of the Vision Transformer (</w:t>
-      </w:r>
-      <w:proofErr w:type="spellStart"/>
-      <w:r>
-        <w:rPr>
-          <w:lang w:val="en-IN"/>
-        </w:rPr>
-        <w:t>ViT</w:t>
-      </w:r>
-      <w:proofErr w:type="spellEnd"/>
-      <w:r>
-        <w:rPr>
-          <w:lang w:val="en-IN"/>
-        </w:rPr>
-        <w:t xml:space="preserve">) </w:t>
-      </w:r>
-      <w:r>
-        <w:t xml:space="preserve">has introduced an alternative processing framework that completely discards localized convolutional strides. By flattening spectrogram grids into sequential, non-overlapping linear patches, tokens are processed via multi-head self-attention mechanisms. This allows every single patch to interact with every other patch across the entire time-frequency domain simultaneously. This enables the model to </w:t>
-      </w:r>
-      <w:proofErr w:type="gramStart"/>
-      <w:r>
-        <w:t>look</w:t>
-      </w:r>
-      <w:proofErr w:type="gramEnd"/>
-      <w:r>
-        <w:t xml:space="preserve"> past localized features and evaluate global, long-range temporal-frequency dependencies across the entire duration of an acoustic sample. However, because transformers lack built-in spatial assumptions, they have a completely flat inductive bias. They require significantly longer optimization paths to find sharp minimums on a loss surface.</w:t>
-      </w:r>
-    </w:p>
-    <w:p>
-      <w:r>
+        <w:t xml:space="preserve">Conversely, the emergence of the Vision Transformer (ViT) </w:t>
+      </w:r>
+      <w:r>
+        <w:t>has introduced an alternative processing framework that completely discards localized convolutional strides. By flattening spectrogram grids into sequential, non-overlapping linear patches, tokens are processed via multi-head self-attention mechanisms. This allows every single patch to interact with every other patch across the entire time-frequency domain simultaneously. This enables the model to look past localized features and evaluate global, long-range temporal-frequency dependencies across the entire duration of an acoustic sample. However, because transformers lack built-in spatial assumptions, they have a completely flat inductive bias. They require significantly longer optimization paths to find sharp minimums on a loss surface.</w:t>
+      </w:r>
+    </w:p>
+    <w:p>
+      <w:r>
+        <w:rPr>
+          <w:noProof/>
+        </w:rPr>
         <w:lastRenderedPageBreak/>
         <w:drawing>
           <wp:inline distT="0" distB="0" distL="0" distR="0" wp14:anchorId="059CBC15" wp14:editId="68E82BD9">
@@ -902,47 +801,7 @@
           <w:i/>
           <w:iCs/>
         </w:rPr>
-        <w:t>The foundational Vision Transformer (</w:t>
-      </w:r>
-      <w:proofErr w:type="spellStart"/>
-      <w:r>
-        <w:rPr>
-          <w:b/>
-          <w:bCs/>
-          <w:i/>
-          <w:iCs/>
-        </w:rPr>
-        <w:t>ViT</w:t>
-      </w:r>
-      <w:proofErr w:type="spellEnd"/>
-      <w:r>
-        <w:rPr>
-          <w:b/>
-          <w:bCs/>
-          <w:i/>
-          <w:iCs/>
-        </w:rPr>
-        <w:t xml:space="preserve">) framework (adapted from </w:t>
-      </w:r>
-      <w:proofErr w:type="spellStart"/>
-      <w:r>
-        <w:rPr>
-          <w:b/>
-          <w:bCs/>
-          <w:i/>
-          <w:iCs/>
-        </w:rPr>
-        <w:t>Dosovitskiy</w:t>
-      </w:r>
-      <w:proofErr w:type="spellEnd"/>
-      <w:r>
-        <w:rPr>
-          <w:b/>
-          <w:bCs/>
-          <w:i/>
-          <w:iCs/>
-        </w:rPr>
-        <w:t xml:space="preserve"> et al.</w:t>
+        <w:t>The foundational Vision Transformer (ViT) framework (adapted from Dosovitskiy et al.</w:t>
       </w:r>
       <w:r>
         <w:rPr>
@@ -1002,27 +861,7 @@
           <w:bCs/>
           <w:lang w:val="en-IN"/>
         </w:rPr>
-        <w:t xml:space="preserve">Cross- Attention Hybrids: Integrating CNN </w:t>
-      </w:r>
-      <w:proofErr w:type="gramStart"/>
-      <w:r>
-        <w:rPr>
-          <w:rFonts w:asciiTheme="majorHAnsi" w:hAnsiTheme="majorHAnsi"/>
-          <w:b/>
-          <w:bCs/>
-          <w:lang w:val="en-IN"/>
-        </w:rPr>
-        <w:t>Front-Ends</w:t>
-      </w:r>
-      <w:proofErr w:type="gramEnd"/>
-      <w:r>
-        <w:rPr>
-          <w:rFonts w:asciiTheme="majorHAnsi" w:hAnsiTheme="majorHAnsi"/>
-          <w:b/>
-          <w:bCs/>
-          <w:lang w:val="en-IN"/>
-        </w:rPr>
-        <w:t xml:space="preserve"> with Transformer Tails</w:t>
+        <w:t>Cross- Attention Hybrids: Integrating CNN Front-Ends with Transformer Tails</w:t>
       </w:r>
     </w:p>
     <w:p>
@@ -1049,21 +888,7 @@
         <w:rPr>
           <w:lang w:val="en-IN"/>
         </w:rPr>
-        <w:t xml:space="preserve">designed to harvest the benefits of both worlds. The front-end consists of standard convolutional blocks that </w:t>
-      </w:r>
-      <w:proofErr w:type="spellStart"/>
-      <w:r>
-        <w:rPr>
-          <w:lang w:val="en-IN"/>
-        </w:rPr>
-        <w:t>downsample</w:t>
-      </w:r>
-      <w:proofErr w:type="spellEnd"/>
-      <w:r>
-        <w:rPr>
-          <w:lang w:val="en-IN"/>
-        </w:rPr>
-        <w:t xml:space="preserve"> the raw audio spectrogram and extract highly robust localized features. These feature maps are then flattened and treated as sequential tokens by a downstream Transformer encoder tail. This setup uses the CNN to enforce a strong early inductive bias, allowing the transformer layers to focus purely on modelling long-range temporal relationships among highly polished features.</w:t>
+        <w:t>designed to harvest the benefits of both worlds. The front-end consists of standard convolutional blocks that downsample the raw audio spectrogram and extract highly robust localized features. These feature maps are then flattened and treated as sequential tokens by a downstream Transformer encoder tail. This setup uses the CNN to enforce a strong early inductive bias, allowing the transformer layers to focus purely on modelling long-range temporal relationships among highly polished features.</w:t>
       </w:r>
     </w:p>
     <w:p>
@@ -1085,74 +910,26 @@
           <w:bCs/>
           <w:lang w:val="en-IN"/>
         </w:rPr>
-        <w:t>Data-Efficient Image Transformers (</w:t>
-      </w:r>
-      <w:proofErr w:type="spellStart"/>
-      <w:r>
-        <w:rPr>
-          <w:rFonts w:asciiTheme="majorHAnsi" w:hAnsiTheme="majorHAnsi"/>
-          <w:b/>
-          <w:bCs/>
-          <w:lang w:val="en-IN"/>
-        </w:rPr>
-        <w:t>DeiT</w:t>
-      </w:r>
-      <w:proofErr w:type="spellEnd"/>
-      <w:r>
-        <w:rPr>
-          <w:rFonts w:asciiTheme="majorHAnsi" w:hAnsiTheme="majorHAnsi"/>
-          <w:b/>
-          <w:bCs/>
-          <w:lang w:val="en-IN"/>
-        </w:rPr>
-        <w:t>): Knowledge Distillation Framework</w:t>
-      </w:r>
-    </w:p>
-    <w:p>
-      <w:pPr>
-        <w:rPr>
-          <w:lang w:val="en-IN"/>
-        </w:rPr>
-      </w:pPr>
-      <w:r>
-        <w:rPr>
-          <w:lang w:val="en-IN"/>
-        </w:rPr>
-        <w:t>The Data-Efficient image Transformer (</w:t>
-      </w:r>
-      <w:proofErr w:type="spellStart"/>
-      <w:r>
-        <w:rPr>
-          <w:lang w:val="en-IN"/>
-        </w:rPr>
-        <w:t>DeiT</w:t>
-      </w:r>
-      <w:proofErr w:type="spellEnd"/>
-      <w:r>
-        <w:rPr>
-          <w:lang w:val="en-IN"/>
-        </w:rPr>
-        <w:t>) explicitly</w:t>
-      </w:r>
-      <w:r>
-        <w:rPr>
-          <w:lang w:val="en-IN"/>
-        </w:rPr>
-        <w:t xml:space="preserve"> targets the data-hungry nature of standard transformers by introducing knowledge distillation. Alongside the standard classification token, </w:t>
-      </w:r>
-      <w:proofErr w:type="spellStart"/>
-      <w:r>
-        <w:rPr>
-          <w:lang w:val="en-IN"/>
-        </w:rPr>
-        <w:t>DeiT</w:t>
-      </w:r>
-      <w:proofErr w:type="spellEnd"/>
-      <w:r>
-        <w:rPr>
-          <w:lang w:val="en-IN"/>
-        </w:rPr>
-        <w:t xml:space="preserve"> introduces a specialized </w:t>
+        <w:t>Data-Efficient Image Transformers (DeiT): Knowledge Distillation Framework</w:t>
+      </w:r>
+    </w:p>
+    <w:p>
+      <w:pPr>
+        <w:rPr>
+          <w:lang w:val="en-IN"/>
+        </w:rPr>
+      </w:pPr>
+      <w:r>
+        <w:rPr>
+          <w:lang w:val="en-IN"/>
+        </w:rPr>
+        <w:t>The Data-Efficient image Transformer (DeiT) explicitly</w:t>
+      </w:r>
+      <w:r>
+        <w:rPr>
+          <w:lang w:val="en-IN"/>
+        </w:rPr>
+        <w:t xml:space="preserve"> targets the data-hungry nature of standard transformers by introducing knowledge distillation. Alongside the standard classification token, DeiT introduces a specialized </w:t>
       </w:r>
       <w:r>
         <w:rPr>
@@ -1174,7 +951,41 @@
           <w:bCs/>
           <w:lang w:val="en-IN"/>
         </w:rPr>
-        <w:t xml:space="preserve">Resnet 50. </w:t>
+        <w:t>Resnet 50</w:t>
+      </w:r>
+      <w:r>
+        <w:rPr>
+          <w:b/>
+          <w:bCs/>
+          <w:lang w:val="en-IN"/>
+        </w:rPr>
+        <w:t xml:space="preserve"> </w:t>
+      </w:r>
+      <w:r>
+        <w:rPr>
+          <w:lang w:val="en-IN"/>
+        </w:rPr>
+        <w:t>as it was the most efficient</w:t>
+      </w:r>
+      <w:r>
+        <w:rPr>
+          <w:lang w:val="en-IN"/>
+        </w:rPr>
+        <w:t xml:space="preserve"> and highest accuracy</w:t>
+      </w:r>
+      <w:r>
+        <w:rPr>
+          <w:lang w:val="en-IN"/>
+        </w:rPr>
+        <w:t xml:space="preserve"> model among the CNN models</w:t>
+      </w:r>
+      <w:r>
+        <w:rPr>
+          <w:b/>
+          <w:bCs/>
+          <w:lang w:val="en-IN"/>
+        </w:rPr>
+        <w:t xml:space="preserve">. </w:t>
       </w:r>
       <w:r>
         <w:rPr>
@@ -1182,23 +993,13 @@
         </w:rPr>
         <w:t xml:space="preserve">This allows the transformer to directly inherit the localized inductive biases of a CNN without altering its core attention blocks. I tracked two distinct variants of this framework: </w:t>
       </w:r>
-      <w:proofErr w:type="spellStart"/>
-      <w:r>
-        <w:rPr>
-          <w:b/>
-          <w:bCs/>
-          <w:lang w:val="en-IN"/>
-        </w:rPr>
-        <w:t>DeiT</w:t>
-      </w:r>
-      <w:proofErr w:type="spellEnd"/>
-      <w:r>
-        <w:rPr>
-          <w:b/>
-          <w:bCs/>
-          <w:lang w:val="en-IN"/>
-        </w:rPr>
-        <w:t xml:space="preserve">-Hard </w:t>
+      <w:r>
+        <w:rPr>
+          <w:b/>
+          <w:bCs/>
+          <w:lang w:val="en-IN"/>
+        </w:rPr>
+        <w:t xml:space="preserve">DeiT-Hard </w:t>
       </w:r>
       <w:r>
         <w:rPr>
@@ -1206,23 +1007,13 @@
         </w:rPr>
         <w:t xml:space="preserve">(which forces the student to match the hard argmax label of the teacher) and </w:t>
       </w:r>
-      <w:proofErr w:type="spellStart"/>
-      <w:r>
-        <w:rPr>
-          <w:b/>
-          <w:bCs/>
-          <w:lang w:val="en-IN"/>
-        </w:rPr>
-        <w:t>DeiT</w:t>
-      </w:r>
-      <w:proofErr w:type="spellEnd"/>
-      <w:r>
-        <w:rPr>
-          <w:b/>
-          <w:bCs/>
-          <w:lang w:val="en-IN"/>
-        </w:rPr>
-        <w:t xml:space="preserve">-Soft </w:t>
+      <w:r>
+        <w:rPr>
+          <w:b/>
+          <w:bCs/>
+          <w:lang w:val="en-IN"/>
+        </w:rPr>
+        <w:t xml:space="preserve">DeiT-Soft </w:t>
       </w:r>
       <w:r>
         <w:rPr>
@@ -1333,51 +1124,7 @@
           <w:i/>
           <w:iCs/>
         </w:rPr>
-        <w:t xml:space="preserve">The </w:t>
-      </w:r>
-      <w:proofErr w:type="spellStart"/>
-      <w:r>
-        <w:rPr>
-          <w:rFonts w:asciiTheme="majorHAnsi" w:hAnsiTheme="majorHAnsi"/>
-          <w:b/>
-          <w:bCs/>
-          <w:i/>
-          <w:iCs/>
-        </w:rPr>
-        <w:t>DeiT</w:t>
-      </w:r>
-      <w:proofErr w:type="spellEnd"/>
-      <w:r>
-        <w:rPr>
-          <w:rFonts w:asciiTheme="majorHAnsi" w:hAnsiTheme="majorHAnsi"/>
-          <w:b/>
-          <w:bCs/>
-          <w:i/>
-          <w:iCs/>
-        </w:rPr>
-        <w:t xml:space="preserve"> teacher-student knowledge distillation pipeline framework featuring the specialized distillation token. (Reprinted from </w:t>
-      </w:r>
-      <w:proofErr w:type="spellStart"/>
-      <w:r>
-        <w:rPr>
-          <w:rFonts w:asciiTheme="majorHAnsi" w:hAnsiTheme="majorHAnsi"/>
-          <w:b/>
-          <w:bCs/>
-          <w:i/>
-          <w:iCs/>
-        </w:rPr>
-        <w:t>Touvron</w:t>
-      </w:r>
-      <w:proofErr w:type="spellEnd"/>
-      <w:r>
-        <w:rPr>
-          <w:rFonts w:asciiTheme="majorHAnsi" w:hAnsiTheme="majorHAnsi"/>
-          <w:b/>
-          <w:bCs/>
-          <w:i/>
-          <w:iCs/>
-        </w:rPr>
-        <w:t xml:space="preserve"> et al. </w:t>
+        <w:t xml:space="preserve">The DeiT teacher-student knowledge distillation pipeline framework featuring the specialized distillation token. (Reprinted from Touvron et al. </w:t>
       </w:r>
       <w:hyperlink w:anchor="Ref_Touvron" w:history="1">
         <w:r>
@@ -1509,87 +1256,21 @@
         <w:rPr>
           <w:lang w:val="en-IN"/>
         </w:rPr>
-        <w:t xml:space="preserve">To eliminate massive input/output hardware bottlenecks, I designed a pre-computing pipeline. Rather than executing expensive on the fly short Time Fourier Transforms (STFT) inside the </w:t>
-      </w:r>
-      <w:proofErr w:type="spellStart"/>
-      <w:r>
-        <w:rPr>
-          <w:lang w:val="en-IN"/>
-        </w:rPr>
-        <w:t>dataloader</w:t>
-      </w:r>
-      <w:proofErr w:type="spellEnd"/>
-      <w:r>
-        <w:rPr>
-          <w:lang w:val="en-IN"/>
-        </w:rPr>
-        <w:t xml:space="preserve"> on every epoch, I processed the raw waveforms into static, optimized 2D spectrogram matrices and saved them directly to disk as tensor arrays beforehand. During training, the </w:t>
-      </w:r>
-      <w:proofErr w:type="spellStart"/>
-      <w:r>
-        <w:rPr>
-          <w:lang w:val="en-IN"/>
-        </w:rPr>
-        <w:t>dataloader</w:t>
-      </w:r>
-      <w:proofErr w:type="spellEnd"/>
-      <w:r>
-        <w:rPr>
-          <w:lang w:val="en-IN"/>
-        </w:rPr>
-        <w:t xml:space="preserve"> performs a raw disk read of these pre-computed tensors, isolating model performance from CPU calculation latency. Furthermore, because spoofing datasets are heavily skewed due to the sheer volume of synthetic variants generated per audio source, I heavily skewed due to the sheer volume of synthetic variants generated per audio source, I integrated a </w:t>
-      </w:r>
-      <w:proofErr w:type="spellStart"/>
-      <w:r>
-        <w:rPr>
-          <w:b/>
-          <w:bCs/>
-          <w:lang w:val="en-IN"/>
-        </w:rPr>
-        <w:t>WeightedRandomSampler</w:t>
-      </w:r>
-      <w:proofErr w:type="spellEnd"/>
-      <w:r>
-        <w:rPr>
-          <w:b/>
-          <w:bCs/>
-          <w:lang w:val="en-IN"/>
-        </w:rPr>
-        <w:t xml:space="preserve"> </w:t>
-      </w:r>
-      <w:r>
-        <w:rPr>
-          <w:lang w:val="en-IN"/>
-        </w:rPr>
-        <w:t xml:space="preserve">into the </w:t>
-      </w:r>
-      <w:proofErr w:type="spellStart"/>
-      <w:r>
-        <w:rPr>
-          <w:lang w:val="en-IN"/>
-        </w:rPr>
-        <w:t>Pytorch</w:t>
-      </w:r>
-      <w:proofErr w:type="spellEnd"/>
-      <w:r>
-        <w:rPr>
-          <w:lang w:val="en-IN"/>
-        </w:rPr>
-        <w:t xml:space="preserve"> pipeline. By adjusting batch drawing probabilities based on reciprocal of class frequencies, I ensured every </w:t>
-      </w:r>
-      <w:proofErr w:type="gramStart"/>
-      <w:r>
-        <w:rPr>
-          <w:lang w:val="en-IN"/>
-        </w:rPr>
-        <w:t>mini-batch</w:t>
-      </w:r>
-      <w:proofErr w:type="gramEnd"/>
-      <w:r>
-        <w:rPr>
-          <w:lang w:val="en-IN"/>
-        </w:rPr>
-        <w:t xml:space="preserve"> maintained a strict, mathematically balanced </w:t>
+        <w:t xml:space="preserve">To eliminate massive input/output hardware bottlenecks, I designed a pre-computing pipeline. Rather than executing expensive on the fly short Time Fourier Transforms (STFT) inside the dataloader on every epoch, I processed the raw waveforms into static, optimized 2D spectrogram matrices and saved them directly to disk as tensor arrays beforehand. During training, the dataloader performs a raw disk read of these pre-computed tensors, isolating model performance from CPU calculation latency. Furthermore, because spoofing datasets are heavily skewed due to the sheer volume of synthetic variants generated per audio source, I heavily skewed due to the sheer volume of synthetic variants generated per audio source, I integrated a </w:t>
+      </w:r>
+      <w:r>
+        <w:rPr>
+          <w:b/>
+          <w:bCs/>
+          <w:lang w:val="en-IN"/>
+        </w:rPr>
+        <w:t xml:space="preserve">WeightedRandomSampler </w:t>
+      </w:r>
+      <w:r>
+        <w:rPr>
+          <w:lang w:val="en-IN"/>
+        </w:rPr>
+        <w:t xml:space="preserve">into the Pytorch pipeline. By adjusting batch drawing probabilities based on reciprocal of class frequencies, I ensured every mini-batch maintained a strict, mathematically balanced </w:t>
       </w:r>
       <w:r>
         <w:rPr>
@@ -1860,21 +1541,7 @@
         <w:rPr>
           <w:lang w:val="en-IN"/>
         </w:rPr>
-        <w:t xml:space="preserve">samples per </w:t>
-      </w:r>
-      <w:proofErr w:type="gramStart"/>
-      <w:r>
-        <w:rPr>
-          <w:lang w:val="en-IN"/>
-        </w:rPr>
-        <w:t>mini-batch</w:t>
-      </w:r>
-      <w:proofErr w:type="gramEnd"/>
-      <w:r>
-        <w:rPr>
-          <w:lang w:val="en-IN"/>
-        </w:rPr>
-        <w:t>, optimized to maximize GPU VRAM utilization and ensure highly stable gradient trajectories.</w:t>
+        <w:t>samples per mini-batch, optimized to maximize GPU VRAM utilization and ensure highly stable gradient trajectories.</w:t>
       </w:r>
     </w:p>
     <w:p>
@@ -2065,10 +1732,11 @@
             </m:den>
           </m:f>
           <m:r>
+            <m:rPr>
+              <m:sty m:val="b"/>
+            </m:rPr>
             <w:rPr>
               <w:rFonts w:ascii="Cambria Math" w:hAnsi="Cambria Math"/>
-              <w:b/>
-              <w:bCs/>
             </w:rPr>
             <w:br/>
           </m:r>
@@ -2207,11 +1875,11 @@
             </m:den>
           </m:f>
           <m:r>
+            <m:rPr>
+              <m:sty m:val="b"/>
+            </m:rPr>
             <w:rPr>
               <w:rFonts w:ascii="Cambria Math" w:hAnsi="Cambria Math"/>
-              <w:b/>
-              <w:bCs/>
-              <w:iCs/>
               <w:color w:val="666666"/>
               <w:lang w:val="en-IN"/>
             </w:rPr>
@@ -2636,10 +2304,10 @@
             </m:e>
           </m:func>
           <m:r>
+            <m:rPr>
+              <m:sty m:val="bi"/>
+            </m:rPr>
             <w:rPr>
-              <w:b/>
-              <w:bCs/>
-              <w:i/>
               <w:color w:val="666666"/>
             </w:rPr>
             <w:br/>
@@ -2706,23 +2374,7 @@
           <w:rFonts w:asciiTheme="majorHAnsi" w:hAnsiTheme="majorHAnsi"/>
           <w:lang w:val="en-IN"/>
         </w:rPr>
-        <w:t>In my initial experimental phase, I applied a standard training setup utilizing a rigid early stopping monitor configured with a tight patience window (</w:t>
-      </w:r>
-      <w:proofErr w:type="spellStart"/>
-      <w:r>
-        <w:rPr>
-          <w:rFonts w:asciiTheme="majorHAnsi" w:hAnsiTheme="majorHAnsi"/>
-          <w:lang w:val="en-IN"/>
-        </w:rPr>
-        <w:t>e.g</w:t>
-      </w:r>
-      <w:proofErr w:type="spellEnd"/>
-      <w:r>
-        <w:rPr>
-          <w:rFonts w:asciiTheme="majorHAnsi" w:hAnsiTheme="majorHAnsi"/>
-          <w:lang w:val="en-IN"/>
-        </w:rPr>
-        <w:t xml:space="preserve"> stopping the run if validation loss did not improve for 15 consecutive epochs).</w:t>
+        <w:t>In my initial experimental phase, I applied a standard training setup utilizing a rigid early stopping monitor configured with a tight patience window (e.g stopping the run if validation loss did not improve for 15 consecutive epochs).</w:t>
       </w:r>
     </w:p>
     <w:p>
@@ -2948,21 +2600,7 @@
         <w:rPr>
           <w:rFonts w:asciiTheme="majorHAnsi" w:hAnsiTheme="majorHAnsi"/>
         </w:rPr>
-        <w:t xml:space="preserve">[1] Hugo </w:t>
-      </w:r>
-      <w:proofErr w:type="spellStart"/>
-      <w:r>
-        <w:rPr>
-          <w:rFonts w:asciiTheme="majorHAnsi" w:hAnsiTheme="majorHAnsi"/>
-        </w:rPr>
-        <w:t>Touvron</w:t>
-      </w:r>
-      <w:proofErr w:type="spellEnd"/>
-      <w:r>
-        <w:rPr>
-          <w:rFonts w:asciiTheme="majorHAnsi" w:hAnsiTheme="majorHAnsi"/>
-        </w:rPr>
-        <w:t xml:space="preserve">, Matthieu Cord, Matthijs Douze, Francisco Massa, Alexandre Sablayrolles, Hervé Jégou. "Training data-efficient image transformers &amp; distillation through attention." </w:t>
+        <w:t xml:space="preserve">[1] Hugo Touvron, Matthieu Cord, Matthijs Douze, Francisco Massa, Alexandre Sablayrolles, Hervé Jégou. "Training data-efficient image transformers &amp; distillation through attention." </w:t>
       </w:r>
       <w:r>
         <w:rPr>
@@ -2976,21 +2614,7 @@
         <w:rPr>
           <w:rFonts w:asciiTheme="majorHAnsi" w:hAnsiTheme="majorHAnsi"/>
         </w:rPr>
-        <w:t xml:space="preserve">, 2021. </w:t>
-      </w:r>
-      <w:proofErr w:type="spellStart"/>
-      <w:r>
-        <w:rPr>
-          <w:rFonts w:asciiTheme="majorHAnsi" w:hAnsiTheme="majorHAnsi"/>
-        </w:rPr>
-        <w:t>arXiv</w:t>
-      </w:r>
-      <w:proofErr w:type="spellEnd"/>
-      <w:r>
-        <w:rPr>
-          <w:rFonts w:asciiTheme="majorHAnsi" w:hAnsiTheme="majorHAnsi"/>
-        </w:rPr>
-        <w:t xml:space="preserve"> preprint arXiv:2012.12877</w:t>
+        <w:t>, 2021. arXiv preprint arXiv:2012.12877</w:t>
       </w:r>
       <w:bookmarkEnd w:id="0"/>
     </w:p>
@@ -3011,21 +2635,7 @@
         <w:rPr>
           <w:rFonts w:asciiTheme="majorHAnsi" w:hAnsiTheme="majorHAnsi"/>
         </w:rPr>
-        <w:t xml:space="preserve">Alexey Dosovitskiy, Lucas Beyer, Alexander Kolesnikov, Dirk Weissenborn, Xiaohua Zhai, Thomas Unterthiner, Mostafa Dehghani, Matthias Minderer, Georg Heigold, Sylvain Gelly, et al. An image is worth 16x16 words: Transformers for image recognition at scale. </w:t>
-      </w:r>
-      <w:proofErr w:type="spellStart"/>
-      <w:r>
-        <w:rPr>
-          <w:rFonts w:asciiTheme="majorHAnsi" w:hAnsiTheme="majorHAnsi"/>
-        </w:rPr>
-        <w:t>arXiv</w:t>
-      </w:r>
-      <w:proofErr w:type="spellEnd"/>
-      <w:r>
-        <w:rPr>
-          <w:rFonts w:asciiTheme="majorHAnsi" w:hAnsiTheme="majorHAnsi"/>
-        </w:rPr>
-        <w:t xml:space="preserve"> preprint arXiv:2010.11929, 2020.</w:t>
+        <w:t>Alexey Dosovitskiy, Lucas Beyer, Alexander Kolesnikov, Dirk Weissenborn, Xiaohua Zhai, Thomas Unterthiner, Mostafa Dehghani, Matthias Minderer, Georg Heigold, Sylvain Gelly, et al. An image is worth 16x16 words: Transformers for image recognition at scale. arXiv preprint arXiv:2010.11929, 2020.</w:t>
       </w:r>
       <w:bookmarkEnd w:id="1"/>
     </w:p>
@@ -3043,18 +2653,7 @@
       </w:r>
       <w:bookmarkStart w:id="2" w:name="Swin_Paper"/>
       <w:r>
-        <w:t xml:space="preserve">Ze Liu, Yutong Lin, Yue Cao, Han Hu, Yixuan Wei, Zheng Zhang, Stephen Lin, </w:t>
-      </w:r>
-      <w:proofErr w:type="spellStart"/>
-      <w:r>
-        <w:t>Baining</w:t>
-      </w:r>
-      <w:proofErr w:type="spellEnd"/>
-      <w:r>
-        <w:t xml:space="preserve"> Guo, </w:t>
-      </w:r>
-      <w:r>
-        <w:t xml:space="preserve">"Swin transformer: Hierarchical vision transformer using shifted windows," in </w:t>
+        <w:t xml:space="preserve">Ze Liu, Yutong Lin, Yue Cao, Han Hu, Yixuan Wei, Zheng Zhang, Stephen Lin, Baining Guo, "Swin transformer: Hierarchical vision transformer using shifted windows," in </w:t>
       </w:r>
       <w:r>
         <w:rPr>
@@ -3064,15 +2663,7 @@
         <w:t>Proceedings of the IEEE/CVF International Conference on Computer Vision (ICCV)</w:t>
       </w:r>
       <w:r>
-        <w:t xml:space="preserve">, 2021, pp. 10012-10022. </w:t>
-      </w:r>
-      <w:proofErr w:type="spellStart"/>
-      <w:r>
-        <w:t>arXiv</w:t>
-      </w:r>
-      <w:proofErr w:type="spellEnd"/>
-      <w:r>
-        <w:t xml:space="preserve"> preprint arXiv:2103.14030.</w:t>
+        <w:t>, 2021, pp. 10012-10022. arXiv preprint arXiv:2103.14030.</w:t>
       </w:r>
       <w:bookmarkEnd w:id="2"/>
     </w:p>
@@ -5664,6 +5255,7 @@
   <w:style w:type="character" w:default="1" w:styleId="DefaultParagraphFont">
     <w:name w:val="Default Paragraph Font"/>
     <w:uiPriority w:val="1"/>
+    <w:semiHidden/>
     <w:unhideWhenUsed/>
   </w:style>
   <w:style w:type="table" w:default="1" w:styleId="TableNormal">

</xml_diff>